<commit_message>
Nur Forecast für genau einen Tag zurückgeben
</commit_message>
<xml_diff>
--- a/Demo/Demo.docx
+++ b/Demo/Demo.docx
@@ -4,19 +4,32 @@
   <w:body>
     <w:p>
       <w:r>
-        <w:t>Nutzereingabe in Swagger:</w:t>
+        <w:t>Nutzereingabe in Swagger</w:t>
+      </w:r>
+      <w:r>
+        <w:t xml:space="preserve"> (</w:t>
+      </w:r>
+      <w:r>
+        <w:rPr>
+          <w:b/>
+          <w:bCs/>
+        </w:rPr>
+        <w:t>Beispiel 1</w:t>
+      </w:r>
+      <w:r>
+        <w:t>)</w:t>
+      </w:r>
+      <w:r>
+        <w:t>:</w:t>
       </w:r>
     </w:p>
     <w:p>
       <w:r>
-        <w:br/>
-      </w:r>
-      <w:r>
         <w:drawing>
-          <wp:inline distT="0" distB="0" distL="0" distR="0" wp14:anchorId="5A8E12C9" wp14:editId="037CACC3">
-            <wp:extent cx="5760720" cy="1725295"/>
-            <wp:effectExtent l="19050" t="19050" r="11430" b="27305"/>
-            <wp:docPr id="543300502" name="Grafik 1"/>
+          <wp:inline distT="0" distB="0" distL="0" distR="0" wp14:anchorId="6E789066" wp14:editId="22489510">
+            <wp:extent cx="4953691" cy="1810003"/>
+            <wp:effectExtent l="19050" t="19050" r="18415" b="19050"/>
+            <wp:docPr id="1702062736" name="Grafik 1"/>
             <wp:cNvGraphicFramePr>
               <a:graphicFrameLocks xmlns:a="http://schemas.openxmlformats.org/drawingml/2006/main" noChangeAspect="1"/>
             </wp:cNvGraphicFramePr>
@@ -24,7 +37,7 @@
               <a:graphicData uri="http://schemas.openxmlformats.org/drawingml/2006/picture">
                 <pic:pic xmlns:pic="http://schemas.openxmlformats.org/drawingml/2006/picture">
                   <pic:nvPicPr>
-                    <pic:cNvPr id="543300502" name=""/>
+                    <pic:cNvPr id="1702062736" name=""/>
                     <pic:cNvPicPr/>
                   </pic:nvPicPr>
                   <pic:blipFill>
@@ -36,7 +49,7 @@
                   <pic:spPr>
                     <a:xfrm>
                       <a:off x="0" y="0"/>
-                      <a:ext cx="5760720" cy="1725295"/>
+                      <a:ext cx="4953691" cy="1810003"/>
                     </a:xfrm>
                     <a:prstGeom prst="rect">
                       <a:avLst/>
@@ -57,10 +70,211 @@
     <w:p/>
     <w:p>
       <w:r>
-        <w:t>Rückgabe:</w:t>
+        <w:t>Rückgabe</w:t>
+      </w:r>
+      <w:r>
+        <w:t xml:space="preserve"> </w:t>
+      </w:r>
+      <w:r>
+        <w:t>(</w:t>
+      </w:r>
+      <w:r>
+        <w:rPr>
+          <w:b/>
+          <w:bCs/>
+        </w:rPr>
+        <w:t>Beispiel 1</w:t>
+      </w:r>
+      <w:r>
+        <w:t>):</w:t>
+      </w:r>
+    </w:p>
+    <w:p>
+      <w:r>
+        <w:drawing>
+          <wp:inline distT="0" distB="0" distL="0" distR="0" wp14:anchorId="3C467AB5" wp14:editId="28352C9E">
+            <wp:extent cx="5760720" cy="481965"/>
+            <wp:effectExtent l="19050" t="19050" r="11430" b="13335"/>
+            <wp:docPr id="1578255058" name="Grafik 1"/>
+            <wp:cNvGraphicFramePr>
+              <a:graphicFrameLocks xmlns:a="http://schemas.openxmlformats.org/drawingml/2006/main" noChangeAspect="1"/>
+            </wp:cNvGraphicFramePr>
+            <a:graphic xmlns:a="http://schemas.openxmlformats.org/drawingml/2006/main">
+              <a:graphicData uri="http://schemas.openxmlformats.org/drawingml/2006/picture">
+                <pic:pic xmlns:pic="http://schemas.openxmlformats.org/drawingml/2006/picture">
+                  <pic:nvPicPr>
+                    <pic:cNvPr id="1578255058" name=""/>
+                    <pic:cNvPicPr/>
+                  </pic:nvPicPr>
+                  <pic:blipFill>
+                    <a:blip r:embed="rId5"/>
+                    <a:stretch>
+                      <a:fillRect/>
+                    </a:stretch>
+                  </pic:blipFill>
+                  <pic:spPr>
+                    <a:xfrm>
+                      <a:off x="0" y="0"/>
+                      <a:ext cx="5760720" cy="481965"/>
+                    </a:xfrm>
+                    <a:prstGeom prst="rect">
+                      <a:avLst/>
+                    </a:prstGeom>
+                    <a:ln w="19050">
+                      <a:solidFill>
+                        <a:schemeClr val="tx1"/>
+                      </a:solidFill>
+                    </a:ln>
+                  </pic:spPr>
+                </pic:pic>
+              </a:graphicData>
+            </a:graphic>
+          </wp:inline>
+        </w:drawing>
       </w:r>
     </w:p>
     <w:p/>
+    <w:p>
+      <w:pPr>
+        <w:pBdr>
+          <w:bottom w:val="single" w:sz="6" w:space="1" w:color="auto"/>
+        </w:pBdr>
+      </w:pPr>
+    </w:p>
+    <w:p/>
+    <w:p>
+      <w:r>
+        <w:t>Nutzereingabe in Swagger (</w:t>
+      </w:r>
+      <w:r>
+        <w:rPr>
+          <w:b/>
+          <w:bCs/>
+        </w:rPr>
+        <w:t xml:space="preserve">Beispiel </w:t>
+      </w:r>
+      <w:r>
+        <w:rPr>
+          <w:b/>
+          <w:bCs/>
+        </w:rPr>
+        <w:t>2</w:t>
+      </w:r>
+      <w:r>
+        <w:t>):</w:t>
+      </w:r>
+    </w:p>
+    <w:p>
+      <w:r>
+        <w:drawing>
+          <wp:inline distT="0" distB="0" distL="0" distR="0" wp14:anchorId="56F2DC37" wp14:editId="687B8A87">
+            <wp:extent cx="5760720" cy="1310640"/>
+            <wp:effectExtent l="19050" t="19050" r="11430" b="22860"/>
+            <wp:docPr id="119678272" name="Grafik 1"/>
+            <wp:cNvGraphicFramePr>
+              <a:graphicFrameLocks xmlns:a="http://schemas.openxmlformats.org/drawingml/2006/main" noChangeAspect="1"/>
+            </wp:cNvGraphicFramePr>
+            <a:graphic xmlns:a="http://schemas.openxmlformats.org/drawingml/2006/main">
+              <a:graphicData uri="http://schemas.openxmlformats.org/drawingml/2006/picture">
+                <pic:pic xmlns:pic="http://schemas.openxmlformats.org/drawingml/2006/picture">
+                  <pic:nvPicPr>
+                    <pic:cNvPr id="119678272" name=""/>
+                    <pic:cNvPicPr/>
+                  </pic:nvPicPr>
+                  <pic:blipFill>
+                    <a:blip r:embed="rId6"/>
+                    <a:stretch>
+                      <a:fillRect/>
+                    </a:stretch>
+                  </pic:blipFill>
+                  <pic:spPr>
+                    <a:xfrm>
+                      <a:off x="0" y="0"/>
+                      <a:ext cx="5760720" cy="1310640"/>
+                    </a:xfrm>
+                    <a:prstGeom prst="rect">
+                      <a:avLst/>
+                    </a:prstGeom>
+                    <a:ln w="19050">
+                      <a:solidFill>
+                        <a:schemeClr val="tx1"/>
+                      </a:solidFill>
+                    </a:ln>
+                  </pic:spPr>
+                </pic:pic>
+              </a:graphicData>
+            </a:graphic>
+          </wp:inline>
+        </w:drawing>
+      </w:r>
+    </w:p>
+    <w:p/>
+    <w:p>
+      <w:r>
+        <w:t>Rückgabe (</w:t>
+      </w:r>
+      <w:r>
+        <w:rPr>
+          <w:b/>
+          <w:bCs/>
+        </w:rPr>
+        <w:t xml:space="preserve">Beispiel </w:t>
+      </w:r>
+      <w:r>
+        <w:rPr>
+          <w:b/>
+          <w:bCs/>
+        </w:rPr>
+        <w:t>2</w:t>
+      </w:r>
+      <w:r>
+        <w:t>):</w:t>
+      </w:r>
+    </w:p>
+    <w:p>
+      <w:r>
+        <w:drawing>
+          <wp:inline distT="0" distB="0" distL="0" distR="0" wp14:anchorId="1227987B" wp14:editId="4B517A29">
+            <wp:extent cx="5760720" cy="509905"/>
+            <wp:effectExtent l="19050" t="19050" r="11430" b="23495"/>
+            <wp:docPr id="708670265" name="Grafik 1"/>
+            <wp:cNvGraphicFramePr>
+              <a:graphicFrameLocks xmlns:a="http://schemas.openxmlformats.org/drawingml/2006/main" noChangeAspect="1"/>
+            </wp:cNvGraphicFramePr>
+            <a:graphic xmlns:a="http://schemas.openxmlformats.org/drawingml/2006/main">
+              <a:graphicData uri="http://schemas.openxmlformats.org/drawingml/2006/picture">
+                <pic:pic xmlns:pic="http://schemas.openxmlformats.org/drawingml/2006/picture">
+                  <pic:nvPicPr>
+                    <pic:cNvPr id="708670265" name=""/>
+                    <pic:cNvPicPr/>
+                  </pic:nvPicPr>
+                  <pic:blipFill>
+                    <a:blip r:embed="rId7"/>
+                    <a:stretch>
+                      <a:fillRect/>
+                    </a:stretch>
+                  </pic:blipFill>
+                  <pic:spPr>
+                    <a:xfrm>
+                      <a:off x="0" y="0"/>
+                      <a:ext cx="5760720" cy="509905"/>
+                    </a:xfrm>
+                    <a:prstGeom prst="rect">
+                      <a:avLst/>
+                    </a:prstGeom>
+                    <a:ln w="19050">
+                      <a:solidFill>
+                        <a:schemeClr val="tx1"/>
+                      </a:solidFill>
+                    </a:ln>
+                  </pic:spPr>
+                </pic:pic>
+              </a:graphicData>
+            </a:graphic>
+          </wp:inline>
+        </w:drawing>
+      </w:r>
+    </w:p>
     <w:sectPr>
       <w:pgSz w:w="11906" w:h="16838"/>
       <w:pgMar w:top="1417" w:right="1417" w:bottom="1134" w:left="1417" w:header="708" w:footer="708" w:gutter="0"/>

</xml_diff>

<commit_message>
Fallback für Stadt, Datum und Stunde ergänzt - Stadt über IP, Datum = heute, Stunde = jetzt +2, falls LLM keine Werte liefert
</commit_message>
<xml_diff>
--- a/Demo/Demo.docx
+++ b/Demo/Demo.docx
@@ -2,6 +2,19 @@
 <file path=word/document.xml><?xml version="1.0" encoding="utf-8"?>
 <w:document xmlns:wpc="http://schemas.microsoft.com/office/word/2010/wordprocessingCanvas" xmlns:cx="http://schemas.microsoft.com/office/drawing/2014/chartex" xmlns:cx1="http://schemas.microsoft.com/office/drawing/2015/9/8/chartex" xmlns:cx2="http://schemas.microsoft.com/office/drawing/2015/10/21/chartex" xmlns:cx3="http://schemas.microsoft.com/office/drawing/2016/5/9/chartex" xmlns:cx4="http://schemas.microsoft.com/office/drawing/2016/5/10/chartex" xmlns:cx5="http://schemas.microsoft.com/office/drawing/2016/5/11/chartex" xmlns:cx6="http://schemas.microsoft.com/office/drawing/2016/5/12/chartex" xmlns:cx7="http://schemas.microsoft.com/office/drawing/2016/5/13/chartex" xmlns:cx8="http://schemas.microsoft.com/office/drawing/2016/5/14/chartex" xmlns:mc="http://schemas.openxmlformats.org/markup-compatibility/2006" xmlns:aink="http://schemas.microsoft.com/office/drawing/2016/ink" xmlns:am3d="http://schemas.microsoft.com/office/drawing/2017/model3d" xmlns:o="urn:schemas-microsoft-com:office:office" xmlns:oel="http://schemas.microsoft.com/office/2019/extlst" xmlns:r="http://schemas.openxmlformats.org/officeDocument/2006/relationships" xmlns:m="http://schemas.openxmlformats.org/officeDocument/2006/math" xmlns:v="urn:schemas-microsoft-com:vml" xmlns:wp14="http://schemas.microsoft.com/office/word/2010/wordprocessingDrawing" xmlns:wp="http://schemas.openxmlformats.org/drawingml/2006/wordprocessingDrawing" xmlns:w10="urn:schemas-microsoft-com:office:word" xmlns:w="http://schemas.openxmlformats.org/wordprocessingml/2006/main" xmlns:w14="http://schemas.microsoft.com/office/word/2010/wordml" xmlns:w15="http://schemas.microsoft.com/office/word/2012/wordml" xmlns:w16cex="http://schemas.microsoft.com/office/word/2018/wordml/cex" xmlns:w16cid="http://schemas.microsoft.com/office/word/2016/wordml/cid" xmlns:w16="http://schemas.microsoft.com/office/word/2018/wordml" xmlns:w16du="http://schemas.microsoft.com/office/word/2023/wordml/word16du" xmlns:w16sdtdh="http://schemas.microsoft.com/office/word/2020/wordml/sdtdatahash" xmlns:w16sdtfl="http://schemas.microsoft.com/office/word/2024/wordml/sdtformatlock" xmlns:w16se="http://schemas.microsoft.com/office/word/2015/wordml/symex" xmlns:wpg="http://schemas.microsoft.com/office/word/2010/wordprocessingGroup" xmlns:wpi="http://schemas.microsoft.com/office/word/2010/wordprocessingInk" xmlns:wne="http://schemas.microsoft.com/office/word/2006/wordml" xmlns:wps="http://schemas.microsoft.com/office/word/2010/wordprocessingShape" mc:Ignorable="w14 w15 w16se w16cid w16 w16cex w16sdtdh w16sdtfl w16du wp14">
   <w:body>
+    <w:p>
+      <w:r>
+        <w:rPr>
+          <w:b/>
+          <w:bCs/>
+        </w:rPr>
+        <w:t>Heutiges Datum:</w:t>
+      </w:r>
+      <w:r>
+        <w:t xml:space="preserve"> 21.11.2025</w:t>
+      </w:r>
+    </w:p>
+    <w:p/>
     <w:p>
       <w:r>
         <w:t>Nutzereingabe in Swagger</w:t>
@@ -25,6 +38,9 @@
     </w:p>
     <w:p>
       <w:r>
+        <w:rPr>
+          <w:noProof/>
+        </w:rPr>
         <w:drawing>
           <wp:inline distT="0" distB="0" distL="0" distR="0" wp14:anchorId="6E789066" wp14:editId="22489510">
             <wp:extent cx="4953691" cy="1810003"/>
@@ -73,10 +89,7 @@
         <w:t>Rückgabe</w:t>
       </w:r>
       <w:r>
-        <w:t xml:space="preserve"> </w:t>
-      </w:r>
-      <w:r>
-        <w:t>(</w:t>
+        <w:t xml:space="preserve"> (</w:t>
       </w:r>
       <w:r>
         <w:rPr>
@@ -91,6 +104,9 @@
     </w:p>
     <w:p>
       <w:r>
+        <w:rPr>
+          <w:noProof/>
+        </w:rPr>
         <w:drawing>
           <wp:inline distT="0" distB="0" distL="0" distR="0" wp14:anchorId="3C467AB5" wp14:editId="28352C9E">
             <wp:extent cx="5760720" cy="481965"/>
@@ -167,10 +183,10 @@
     <w:p>
       <w:r>
         <w:drawing>
-          <wp:inline distT="0" distB="0" distL="0" distR="0" wp14:anchorId="56F2DC37" wp14:editId="687B8A87">
-            <wp:extent cx="5760720" cy="1310640"/>
-            <wp:effectExtent l="19050" t="19050" r="11430" b="22860"/>
-            <wp:docPr id="119678272" name="Grafik 1"/>
+          <wp:inline distT="0" distB="0" distL="0" distR="0" wp14:anchorId="66A1DA2B" wp14:editId="2D63CC4B">
+            <wp:extent cx="5760720" cy="1202055"/>
+            <wp:effectExtent l="19050" t="19050" r="11430" b="17145"/>
+            <wp:docPr id="1424440492" name="Grafik 1"/>
             <wp:cNvGraphicFramePr>
               <a:graphicFrameLocks xmlns:a="http://schemas.openxmlformats.org/drawingml/2006/main" noChangeAspect="1"/>
             </wp:cNvGraphicFramePr>
@@ -178,7 +194,7 @@
               <a:graphicData uri="http://schemas.openxmlformats.org/drawingml/2006/picture">
                 <pic:pic xmlns:pic="http://schemas.openxmlformats.org/drawingml/2006/picture">
                   <pic:nvPicPr>
-                    <pic:cNvPr id="119678272" name=""/>
+                    <pic:cNvPr id="1424440492" name=""/>
                     <pic:cNvPicPr/>
                   </pic:nvPicPr>
                   <pic:blipFill>
@@ -190,7 +206,7 @@
                   <pic:spPr>
                     <a:xfrm>
                       <a:off x="0" y="0"/>
-                      <a:ext cx="5760720" cy="1310640"/>
+                      <a:ext cx="5760720" cy="1202055"/>
                     </a:xfrm>
                     <a:prstGeom prst="rect">
                       <a:avLst/>
@@ -234,10 +250,10 @@
     <w:p>
       <w:r>
         <w:drawing>
-          <wp:inline distT="0" distB="0" distL="0" distR="0" wp14:anchorId="1227987B" wp14:editId="4B517A29">
-            <wp:extent cx="5760720" cy="509905"/>
-            <wp:effectExtent l="19050" t="19050" r="11430" b="23495"/>
-            <wp:docPr id="708670265" name="Grafik 1"/>
+          <wp:inline distT="0" distB="0" distL="0" distR="0" wp14:anchorId="59ECBDCF" wp14:editId="12289077">
+            <wp:extent cx="5760720" cy="533400"/>
+            <wp:effectExtent l="19050" t="19050" r="11430" b="19050"/>
+            <wp:docPr id="54769627" name="Grafik 1"/>
             <wp:cNvGraphicFramePr>
               <a:graphicFrameLocks xmlns:a="http://schemas.openxmlformats.org/drawingml/2006/main" noChangeAspect="1"/>
             </wp:cNvGraphicFramePr>
@@ -245,7 +261,7 @@
               <a:graphicData uri="http://schemas.openxmlformats.org/drawingml/2006/picture">
                 <pic:pic xmlns:pic="http://schemas.openxmlformats.org/drawingml/2006/picture">
                   <pic:nvPicPr>
-                    <pic:cNvPr id="708670265" name=""/>
+                    <pic:cNvPr id="54769627" name=""/>
                     <pic:cNvPicPr/>
                   </pic:nvPicPr>
                   <pic:blipFill>
@@ -257,7 +273,294 @@
                   <pic:spPr>
                     <a:xfrm>
                       <a:off x="0" y="0"/>
-                      <a:ext cx="5760720" cy="509905"/>
+                      <a:ext cx="5760720" cy="533400"/>
+                    </a:xfrm>
+                    <a:prstGeom prst="rect">
+                      <a:avLst/>
+                    </a:prstGeom>
+                    <a:ln w="19050">
+                      <a:solidFill>
+                        <a:schemeClr val="tx1"/>
+                      </a:solidFill>
+                    </a:ln>
+                  </pic:spPr>
+                </pic:pic>
+              </a:graphicData>
+            </a:graphic>
+          </wp:inline>
+        </w:drawing>
+      </w:r>
+    </w:p>
+    <w:p/>
+    <w:p>
+      <w:pPr>
+        <w:pBdr>
+          <w:bottom w:val="single" w:sz="6" w:space="1" w:color="auto"/>
+        </w:pBdr>
+      </w:pPr>
+    </w:p>
+    <w:p/>
+    <w:p/>
+    <w:p>
+      <w:r>
+        <w:t>Nutzereingabe in Swagger (</w:t>
+      </w:r>
+      <w:r>
+        <w:rPr>
+          <w:b/>
+          <w:bCs/>
+        </w:rPr>
+        <w:t xml:space="preserve">Beispiel </w:t>
+      </w:r>
+      <w:r>
+        <w:rPr>
+          <w:b/>
+          <w:bCs/>
+        </w:rPr>
+        <w:t>3</w:t>
+      </w:r>
+      <w:r>
+        <w:t>):</w:t>
+      </w:r>
+    </w:p>
+    <w:p>
+      <w:r>
+        <w:drawing>
+          <wp:inline distT="0" distB="0" distL="0" distR="0" wp14:anchorId="1ADA7865" wp14:editId="1336B81E">
+            <wp:extent cx="5410955" cy="1095528"/>
+            <wp:effectExtent l="19050" t="19050" r="18415" b="28575"/>
+            <wp:docPr id="1823172749" name="Grafik 1"/>
+            <wp:cNvGraphicFramePr>
+              <a:graphicFrameLocks xmlns:a="http://schemas.openxmlformats.org/drawingml/2006/main" noChangeAspect="1"/>
+            </wp:cNvGraphicFramePr>
+            <a:graphic xmlns:a="http://schemas.openxmlformats.org/drawingml/2006/main">
+              <a:graphicData uri="http://schemas.openxmlformats.org/drawingml/2006/picture">
+                <pic:pic xmlns:pic="http://schemas.openxmlformats.org/drawingml/2006/picture">
+                  <pic:nvPicPr>
+                    <pic:cNvPr id="1823172749" name=""/>
+                    <pic:cNvPicPr/>
+                  </pic:nvPicPr>
+                  <pic:blipFill>
+                    <a:blip r:embed="rId8"/>
+                    <a:stretch>
+                      <a:fillRect/>
+                    </a:stretch>
+                  </pic:blipFill>
+                  <pic:spPr>
+                    <a:xfrm>
+                      <a:off x="0" y="0"/>
+                      <a:ext cx="5410955" cy="1095528"/>
+                    </a:xfrm>
+                    <a:prstGeom prst="rect">
+                      <a:avLst/>
+                    </a:prstGeom>
+                    <a:ln w="19050">
+                      <a:solidFill>
+                        <a:schemeClr val="tx1"/>
+                      </a:solidFill>
+                    </a:ln>
+                  </pic:spPr>
+                </pic:pic>
+              </a:graphicData>
+            </a:graphic>
+          </wp:inline>
+        </w:drawing>
+      </w:r>
+    </w:p>
+    <w:p/>
+    <w:p/>
+    <w:p>
+      <w:r>
+        <w:t>Rückgabe (</w:t>
+      </w:r>
+      <w:r>
+        <w:rPr>
+          <w:b/>
+          <w:bCs/>
+        </w:rPr>
+        <w:t xml:space="preserve">Beispiel </w:t>
+      </w:r>
+      <w:r>
+        <w:rPr>
+          <w:b/>
+          <w:bCs/>
+        </w:rPr>
+        <w:t>3</w:t>
+      </w:r>
+      <w:r>
+        <w:t>):</w:t>
+      </w:r>
+    </w:p>
+    <w:p>
+      <w:r>
+        <w:drawing>
+          <wp:inline distT="0" distB="0" distL="0" distR="0" wp14:anchorId="7439EBC2" wp14:editId="4335A3CB">
+            <wp:extent cx="5760720" cy="523875"/>
+            <wp:effectExtent l="19050" t="19050" r="11430" b="28575"/>
+            <wp:docPr id="998530440" name="Grafik 1"/>
+            <wp:cNvGraphicFramePr>
+              <a:graphicFrameLocks xmlns:a="http://schemas.openxmlformats.org/drawingml/2006/main" noChangeAspect="1"/>
+            </wp:cNvGraphicFramePr>
+            <a:graphic xmlns:a="http://schemas.openxmlformats.org/drawingml/2006/main">
+              <a:graphicData uri="http://schemas.openxmlformats.org/drawingml/2006/picture">
+                <pic:pic xmlns:pic="http://schemas.openxmlformats.org/drawingml/2006/picture">
+                  <pic:nvPicPr>
+                    <pic:cNvPr id="998530440" name=""/>
+                    <pic:cNvPicPr/>
+                  </pic:nvPicPr>
+                  <pic:blipFill>
+                    <a:blip r:embed="rId9"/>
+                    <a:stretch>
+                      <a:fillRect/>
+                    </a:stretch>
+                  </pic:blipFill>
+                  <pic:spPr>
+                    <a:xfrm>
+                      <a:off x="0" y="0"/>
+                      <a:ext cx="5760720" cy="523875"/>
+                    </a:xfrm>
+                    <a:prstGeom prst="rect">
+                      <a:avLst/>
+                    </a:prstGeom>
+                    <a:ln w="19050">
+                      <a:solidFill>
+                        <a:schemeClr val="tx1"/>
+                      </a:solidFill>
+                    </a:ln>
+                  </pic:spPr>
+                </pic:pic>
+              </a:graphicData>
+            </a:graphic>
+          </wp:inline>
+        </w:drawing>
+      </w:r>
+    </w:p>
+    <w:p/>
+    <w:p>
+      <w:pPr>
+        <w:pBdr>
+          <w:bottom w:val="single" w:sz="6" w:space="1" w:color="auto"/>
+        </w:pBdr>
+      </w:pPr>
+    </w:p>
+    <w:p/>
+    <w:p/>
+    <w:p>
+      <w:r>
+        <w:t>Nutzereingabe in Swagger (</w:t>
+      </w:r>
+      <w:r>
+        <w:rPr>
+          <w:b/>
+          <w:bCs/>
+        </w:rPr>
+        <w:t xml:space="preserve">Beispiel </w:t>
+      </w:r>
+      <w:r>
+        <w:rPr>
+          <w:b/>
+          <w:bCs/>
+        </w:rPr>
+        <w:t>4</w:t>
+      </w:r>
+      <w:r>
+        <w:t>):</w:t>
+      </w:r>
+    </w:p>
+    <w:p>
+      <w:r>
+        <w:drawing>
+          <wp:inline distT="0" distB="0" distL="0" distR="0" wp14:anchorId="01D72AC8" wp14:editId="63EBDCE0">
+            <wp:extent cx="5760720" cy="944245"/>
+            <wp:effectExtent l="19050" t="19050" r="11430" b="27305"/>
+            <wp:docPr id="1568498529" name="Grafik 1"/>
+            <wp:cNvGraphicFramePr>
+              <a:graphicFrameLocks xmlns:a="http://schemas.openxmlformats.org/drawingml/2006/main" noChangeAspect="1"/>
+            </wp:cNvGraphicFramePr>
+            <a:graphic xmlns:a="http://schemas.openxmlformats.org/drawingml/2006/main">
+              <a:graphicData uri="http://schemas.openxmlformats.org/drawingml/2006/picture">
+                <pic:pic xmlns:pic="http://schemas.openxmlformats.org/drawingml/2006/picture">
+                  <pic:nvPicPr>
+                    <pic:cNvPr id="1568498529" name=""/>
+                    <pic:cNvPicPr/>
+                  </pic:nvPicPr>
+                  <pic:blipFill>
+                    <a:blip r:embed="rId10"/>
+                    <a:stretch>
+                      <a:fillRect/>
+                    </a:stretch>
+                  </pic:blipFill>
+                  <pic:spPr>
+                    <a:xfrm>
+                      <a:off x="0" y="0"/>
+                      <a:ext cx="5760720" cy="944245"/>
+                    </a:xfrm>
+                    <a:prstGeom prst="rect">
+                      <a:avLst/>
+                    </a:prstGeom>
+                    <a:ln w="19050">
+                      <a:solidFill>
+                        <a:schemeClr val="tx1"/>
+                      </a:solidFill>
+                    </a:ln>
+                  </pic:spPr>
+                </pic:pic>
+              </a:graphicData>
+            </a:graphic>
+          </wp:inline>
+        </w:drawing>
+      </w:r>
+    </w:p>
+    <w:p/>
+    <w:p>
+      <w:r>
+        <w:t>Rückgabe (</w:t>
+      </w:r>
+      <w:r>
+        <w:rPr>
+          <w:b/>
+          <w:bCs/>
+        </w:rPr>
+        <w:t xml:space="preserve">Beispiel </w:t>
+      </w:r>
+      <w:r>
+        <w:rPr>
+          <w:b/>
+          <w:bCs/>
+        </w:rPr>
+        <w:t>4</w:t>
+      </w:r>
+      <w:r>
+        <w:t>):</w:t>
+      </w:r>
+    </w:p>
+    <w:p>
+      <w:r>
+        <w:drawing>
+          <wp:inline distT="0" distB="0" distL="0" distR="0" wp14:anchorId="0634E549" wp14:editId="1A4CD530">
+            <wp:extent cx="5760720" cy="531495"/>
+            <wp:effectExtent l="19050" t="19050" r="11430" b="20955"/>
+            <wp:docPr id="153742321" name="Grafik 1"/>
+            <wp:cNvGraphicFramePr>
+              <a:graphicFrameLocks xmlns:a="http://schemas.openxmlformats.org/drawingml/2006/main" noChangeAspect="1"/>
+            </wp:cNvGraphicFramePr>
+            <a:graphic xmlns:a="http://schemas.openxmlformats.org/drawingml/2006/main">
+              <a:graphicData uri="http://schemas.openxmlformats.org/drawingml/2006/picture">
+                <pic:pic xmlns:pic="http://schemas.openxmlformats.org/drawingml/2006/picture">
+                  <pic:nvPicPr>
+                    <pic:cNvPr id="153742321" name=""/>
+                    <pic:cNvPicPr/>
+                  </pic:nvPicPr>
+                  <pic:blipFill>
+                    <a:blip r:embed="rId11"/>
+                    <a:stretch>
+                      <a:fillRect/>
+                    </a:stretch>
+                  </pic:blipFill>
+                  <pic:spPr>
+                    <a:xfrm>
+                      <a:off x="0" y="0"/>
+                      <a:ext cx="5760720" cy="531495"/>
                     </a:xfrm>
                     <a:prstGeom prst="rect">
                       <a:avLst/>

</xml_diff>